<commit_message>
update improve the GUI
</commit_message>
<xml_diff>
--- a/assets/DST_Agricultural_Association_Report_Template.docx
+++ b/assets/DST_Agricultural_Association_Report_Template.docx
@@ -469,9 +469,17 @@
           <w:bCs/>
           <w:color w:val="163A5F"/>
           <w:sz w:val="23"/>
+        </w:rPr>
+        <w:br/>
+      </w:r>
+      <w:r>
+        <w:rPr>
+          <w:rFonts w:ascii="Tajawal" w:eastAsia="Arial" w:hAnsi="Tajawal" w:cs="Tajawal"/>
+          <w:bCs/>
+          <w:color w:val="163A5F"/>
+          <w:sz w:val="23"/>
           <w:rtl/>
         </w:rPr>
-        <w:br/>
         <w:t>بيانات الجمعية</w:t>
       </w:r>
     </w:p>
@@ -489,7 +497,7 @@
       </w:tblGrid>
       <w:tr>
         <w:trPr>
-          <w:trHeight w:val="422"/>
+          <w:trHeight w:val="20"/>
           <w:jc w:val="center"/>
         </w:trPr>
         <w:tc>
@@ -572,7 +580,7 @@
       </w:tr>
       <w:tr>
         <w:trPr>
-          <w:trHeight w:val="269"/>
+          <w:trHeight w:val="20"/>
           <w:jc w:val="center"/>
         </w:trPr>
         <w:tc>
@@ -655,7 +663,7 @@
       </w:tr>
       <w:tr>
         <w:trPr>
-          <w:trHeight w:val="269"/>
+          <w:trHeight w:val="20"/>
           <w:jc w:val="center"/>
         </w:trPr>
         <w:tc>
@@ -743,7 +751,7 @@
       </w:tr>
       <w:tr>
         <w:trPr>
-          <w:trHeight w:val="269"/>
+          <w:trHeight w:val="20"/>
           <w:jc w:val="center"/>
         </w:trPr>
         <w:tc>
@@ -865,7 +873,7 @@
       </w:tblGrid>
       <w:tr>
         <w:trPr>
-          <w:trHeight w:val="144"/>
+          <w:trHeight w:val="20"/>
           <w:jc w:val="center"/>
         </w:trPr>
         <w:tc>
@@ -988,6 +996,7 @@
       </w:tr>
       <w:tr>
         <w:trPr>
+          <w:trHeight w:val="20"/>
           <w:jc w:val="center"/>
         </w:trPr>
         <w:tc>
@@ -1106,6 +1115,7 @@
       </w:tr>
       <w:tr>
         <w:trPr>
+          <w:trHeight w:val="20"/>
           <w:jc w:val="center"/>
         </w:trPr>
         <w:tc>
@@ -1224,6 +1234,7 @@
       </w:tr>
       <w:tr>
         <w:trPr>
+          <w:trHeight w:val="20"/>
           <w:jc w:val="center"/>
         </w:trPr>
         <w:tc>
@@ -1342,6 +1353,7 @@
       </w:tr>
       <w:tr>
         <w:trPr>
+          <w:trHeight w:val="20"/>
           <w:jc w:val="center"/>
         </w:trPr>
         <w:tc>
@@ -1569,7 +1581,7 @@
       </w:tr>
       <w:tr>
         <w:trPr>
-          <w:trHeight w:val="129"/>
+          <w:trHeight w:val="20"/>
           <w:jc w:val="center"/>
         </w:trPr>
         <w:tc>

</xml_diff>

<commit_message>
Enhance Excel analysis and report generation features, including automatic extraction of association code and improved handling of special notes in reports.
</commit_message>
<xml_diff>
--- a/assets/DST_Agricultural_Association_Report_Template.docx
+++ b/assets/DST_Agricultural_Association_Report_Template.docx
@@ -248,7 +248,7 @@
                 <w:sz w:val="22"/>
                 <w:rtl/>
               </w:rPr>
-              <w:t>تاريخ التسليم</w:t>
+              <w:t>الجهة المنفذة</w:t>
             </w:r>
           </w:p>
         </w:tc>
@@ -283,170 +283,10 @@
             <w:r>
               <w:rPr>
                 <w:rFonts w:ascii="Tajawal" w:eastAsia="Arial" w:hAnsi="Tajawal" w:cs="Tajawal"/>
-                <w:sz w:val="22"/>
-                <w:rtl/>
-              </w:rPr>
-              <w:t>01 أكتوبر 2026</w:t>
-            </w:r>
-          </w:p>
-        </w:tc>
-      </w:tr>
-      <w:tr>
-        <w:trPr>
-          <w:jc w:val="center"/>
-        </w:trPr>
-        <w:tc>
-          <w:tcPr>
-            <w:tcW w:w="2304" w:type="dxa"/>
-            <w:tcBorders>
-              <w:top w:val="single" w:sz="6" w:space="0" w:color="D9D9D9"/>
-              <w:left w:val="single" w:sz="6" w:space="0" w:color="D9D9D9"/>
-              <w:bottom w:val="single" w:sz="6" w:space="0" w:color="D9D9D9"/>
-              <w:right w:val="single" w:sz="6" w:space="0" w:color="D9D9D9"/>
-            </w:tcBorders>
-            <w:shd w:val="clear" w:color="auto" w:fill="1D466E"/>
-            <w:tcMar>
-              <w:top w:w="80" w:type="dxa"/>
-              <w:left w:w="110" w:type="dxa"/>
-              <w:bottom w:w="80" w:type="dxa"/>
-              <w:right w:w="110" w:type="dxa"/>
-            </w:tcMar>
-            <w:vAlign w:val="center"/>
-          </w:tcPr>
-          <w:p>
-            <w:pPr>
-              <w:bidi/>
-              <w:spacing w:after="0" w:line="252" w:lineRule="auto"/>
-              <w:jc w:val="center"/>
-              <w:rPr>
-                <w:rFonts w:ascii="Tajawal" w:hAnsi="Tajawal" w:cs="Tajawal"/>
-                <w:sz w:val="22"/>
-              </w:rPr>
-            </w:pPr>
-            <w:r>
-              <w:rPr>
-                <w:rFonts w:ascii="Tajawal" w:eastAsia="Arial" w:hAnsi="Tajawal" w:cs="Tajawal"/>
-                <w:color w:val="FFFFFF"/>
-                <w:sz w:val="22"/>
-                <w:rtl/>
-              </w:rPr>
-              <w:t>الجهة المنفذة</w:t>
-            </w:r>
-          </w:p>
-        </w:tc>
-        <w:tc>
-          <w:tcPr>
-            <w:tcW w:w="2642" w:type="dxa"/>
-            <w:tcBorders>
-              <w:top w:val="single" w:sz="6" w:space="0" w:color="D9D9D9"/>
-              <w:left w:val="single" w:sz="6" w:space="0" w:color="D9D9D9"/>
-              <w:bottom w:val="single" w:sz="6" w:space="0" w:color="D9D9D9"/>
-              <w:right w:val="single" w:sz="6" w:space="0" w:color="D9D9D9"/>
-            </w:tcBorders>
-            <w:shd w:val="clear" w:color="auto" w:fill="F3F5F7"/>
-            <w:tcMar>
-              <w:top w:w="80" w:type="dxa"/>
-              <w:left w:w="110" w:type="dxa"/>
-              <w:bottom w:w="80" w:type="dxa"/>
-              <w:right w:w="110" w:type="dxa"/>
-            </w:tcMar>
-            <w:vAlign w:val="center"/>
-          </w:tcPr>
-          <w:p>
-            <w:pPr>
-              <w:bidi/>
-              <w:spacing w:after="0" w:line="252" w:lineRule="auto"/>
-              <w:jc w:val="center"/>
-              <w:rPr>
-                <w:rFonts w:ascii="Tajawal" w:hAnsi="Tajawal" w:cs="Tajawal"/>
-                <w:sz w:val="22"/>
-              </w:rPr>
-            </w:pPr>
-            <w:r>
-              <w:rPr>
-                <w:rFonts w:ascii="Tajawal" w:eastAsia="Arial" w:hAnsi="Tajawal" w:cs="Tajawal"/>
                 <w:color w:val="252C32"/>
                 <w:sz w:val="22"/>
               </w:rPr>
               <w:t>Civil</w:t>
-            </w:r>
-          </w:p>
-        </w:tc>
-        <w:tc>
-          <w:tcPr>
-            <w:tcW w:w="2642" w:type="dxa"/>
-            <w:tcBorders>
-              <w:top w:val="single" w:sz="6" w:space="0" w:color="D9D9D9"/>
-              <w:left w:val="single" w:sz="6" w:space="0" w:color="D9D9D9"/>
-              <w:bottom w:val="single" w:sz="6" w:space="0" w:color="D9D9D9"/>
-              <w:right w:val="single" w:sz="6" w:space="0" w:color="D9D9D9"/>
-            </w:tcBorders>
-            <w:shd w:val="clear" w:color="auto" w:fill="1D466E"/>
-            <w:tcMar>
-              <w:top w:w="80" w:type="dxa"/>
-              <w:left w:w="110" w:type="dxa"/>
-              <w:bottom w:w="80" w:type="dxa"/>
-              <w:right w:w="110" w:type="dxa"/>
-            </w:tcMar>
-            <w:vAlign w:val="center"/>
-          </w:tcPr>
-          <w:p>
-            <w:pPr>
-              <w:bidi/>
-              <w:spacing w:after="0" w:line="252" w:lineRule="auto"/>
-              <w:jc w:val="center"/>
-              <w:rPr>
-                <w:rFonts w:ascii="Tajawal" w:hAnsi="Tajawal" w:cs="Tajawal"/>
-                <w:sz w:val="22"/>
-              </w:rPr>
-            </w:pPr>
-            <w:r>
-              <w:rPr>
-                <w:rFonts w:ascii="Tajawal" w:eastAsia="Arial" w:hAnsi="Tajawal" w:cs="Tajawal"/>
-                <w:color w:val="FFFFFF"/>
-                <w:sz w:val="22"/>
-                <w:rtl/>
-              </w:rPr>
-              <w:t>حالة التقرير</w:t>
-            </w:r>
-          </w:p>
-        </w:tc>
-        <w:tc>
-          <w:tcPr>
-            <w:tcW w:w="2160" w:type="dxa"/>
-            <w:tcBorders>
-              <w:top w:val="single" w:sz="6" w:space="0" w:color="D9D9D9"/>
-              <w:left w:val="single" w:sz="6" w:space="0" w:color="D9D9D9"/>
-              <w:bottom w:val="single" w:sz="6" w:space="0" w:color="D9D9D9"/>
-              <w:right w:val="single" w:sz="6" w:space="0" w:color="D9D9D9"/>
-            </w:tcBorders>
-            <w:shd w:val="clear" w:color="auto" w:fill="F3F5F7"/>
-            <w:tcMar>
-              <w:top w:w="80" w:type="dxa"/>
-              <w:left w:w="110" w:type="dxa"/>
-              <w:bottom w:w="80" w:type="dxa"/>
-              <w:right w:w="110" w:type="dxa"/>
-            </w:tcMar>
-            <w:vAlign w:val="center"/>
-          </w:tcPr>
-          <w:p>
-            <w:pPr>
-              <w:bidi/>
-              <w:spacing w:after="0" w:line="252" w:lineRule="auto"/>
-              <w:jc w:val="center"/>
-              <w:rPr>
-                <w:rFonts w:ascii="Tajawal" w:hAnsi="Tajawal" w:cs="Tajawal"/>
-                <w:sz w:val="22"/>
-              </w:rPr>
-            </w:pPr>
-            <w:r>
-              <w:rPr>
-                <w:rFonts w:ascii="Tajawal" w:eastAsia="Arial" w:hAnsi="Tajawal" w:cs="Tajawal"/>
-                <w:color w:val="252C32"/>
-                <w:sz w:val="22"/>
-                <w:rtl/>
-              </w:rPr>
-              <w:t>نهائي</w:t>
             </w:r>
           </w:p>
         </w:tc>
@@ -459,8 +299,10 @@
         <w:spacing w:before="100" w:after="0"/>
         <w:jc w:val="center"/>
         <w:rPr>
-          <w:rFonts w:ascii="Tajawal" w:hAnsi="Tajawal" w:cs="Tajawal"/>
+          <w:rFonts w:ascii="Tajawal" w:eastAsia="Arial" w:hAnsi="Tajawal" w:cs="Tajawal"/>
           <w:bCs/>
+          <w:color w:val="163A5F"/>
+          <w:sz w:val="23"/>
         </w:rPr>
       </w:pPr>
       <w:r>
@@ -485,47 +327,59 @@
     </w:p>
     <w:tbl>
       <w:tblPr>
+        <w:tblStyle w:val="TableGrid"/>
         <w:bidiVisual/>
         <w:tblW w:w="0" w:type="auto"/>
         <w:jc w:val="center"/>
-        <w:tblLayout w:type="fixed"/>
+        <w:tblBorders>
+          <w:top w:val="none" w:sz="0" w:space="0" w:color="auto"/>
+          <w:left w:val="none" w:sz="0" w:space="0" w:color="auto"/>
+          <w:bottom w:val="none" w:sz="0" w:space="0" w:color="auto"/>
+          <w:right w:val="none" w:sz="0" w:space="0" w:color="auto"/>
+          <w:insideH w:val="none" w:sz="0" w:space="0" w:color="auto"/>
+          <w:insideV w:val="none" w:sz="0" w:space="0" w:color="auto"/>
+        </w:tblBorders>
+        <w:tblCellMar>
+          <w:left w:w="0" w:type="dxa"/>
+          <w:right w:w="0" w:type="dxa"/>
+        </w:tblCellMar>
         <w:tblLook w:val="04A0" w:firstRow="1" w:lastRow="0" w:firstColumn="1" w:lastColumn="0" w:noHBand="0" w:noVBand="1"/>
       </w:tblPr>
       <w:tblGrid>
-        <w:gridCol w:w="2832"/>
-        <w:gridCol w:w="6262"/>
+        <w:gridCol w:w="2526"/>
+        <w:gridCol w:w="3690"/>
+        <w:gridCol w:w="2250"/>
+        <w:gridCol w:w="2344"/>
       </w:tblGrid>
       <w:tr>
         <w:trPr>
-          <w:trHeight w:val="20"/>
+          <w:trHeight w:val="432"/>
           <w:jc w:val="center"/>
         </w:trPr>
         <w:tc>
           <w:tcPr>
-            <w:tcW w:w="2832" w:type="dxa"/>
+            <w:tcW w:w="2526" w:type="dxa"/>
             <w:tcBorders>
-              <w:top w:val="single" w:sz="6" w:space="0" w:color="D9D9D9"/>
-              <w:left w:val="single" w:sz="6" w:space="0" w:color="D9D9D9"/>
-              <w:bottom w:val="single" w:sz="6" w:space="0" w:color="D9D9D9"/>
-              <w:right w:val="single" w:sz="6" w:space="0" w:color="D9D9D9"/>
+              <w:top w:val="single" w:sz="6" w:space="0" w:color="D9D9D9" w:themeColor="background1" w:themeShade="D9"/>
+              <w:left w:val="single" w:sz="6" w:space="0" w:color="D9D9D9" w:themeColor="background1" w:themeShade="D9"/>
+              <w:bottom w:val="single" w:sz="6" w:space="0" w:color="D9D9D9" w:themeColor="background1" w:themeShade="D9"/>
+              <w:right w:val="single" w:sz="6" w:space="0" w:color="D9D9D9" w:themeColor="background1" w:themeShade="D9"/>
             </w:tcBorders>
-            <w:shd w:val="clear" w:color="auto" w:fill="EAF3F6"/>
-            <w:tcMar>
-              <w:top w:w="90" w:type="dxa"/>
-              <w:left w:w="120" w:type="dxa"/>
-              <w:bottom w:w="90" w:type="dxa"/>
-              <w:right w:w="120" w:type="dxa"/>
-            </w:tcMar>
+            <w:shd w:val="clear" w:color="auto" w:fill="DAEEF3" w:themeFill="accent5" w:themeFillTint="33"/>
             <w:vAlign w:val="center"/>
           </w:tcPr>
           <w:p>
             <w:pPr>
+              <w:keepNext/>
               <w:bidi/>
-              <w:spacing w:after="0" w:line="252" w:lineRule="auto"/>
+              <w:spacing w:after="0"/>
               <w:jc w:val="center"/>
               <w:rPr>
-                <w:rFonts w:ascii="Tajawal" w:hAnsi="Tajawal" w:cs="Tajawal"/>
+                <w:rFonts w:ascii="Tajawal" w:eastAsia="Arial" w:hAnsi="Tajawal" w:cs="Tajawal"/>
                 <w:bCs/>
+                <w:color w:val="163A5F"/>
+                <w:sz w:val="23"/>
+                <w:rtl/>
               </w:rPr>
             </w:pPr>
             <w:r>
@@ -542,29 +396,27 @@
         </w:tc>
         <w:tc>
           <w:tcPr>
-            <w:tcW w:w="6262" w:type="dxa"/>
+            <w:tcW w:w="3690" w:type="dxa"/>
             <w:tcBorders>
-              <w:top w:val="single" w:sz="6" w:space="0" w:color="D9D9D9"/>
-              <w:left w:val="single" w:sz="6" w:space="0" w:color="D9D9D9"/>
-              <w:bottom w:val="single" w:sz="6" w:space="0" w:color="D9D9D9"/>
-              <w:right w:val="single" w:sz="6" w:space="0" w:color="D9D9D9"/>
+              <w:top w:val="single" w:sz="6" w:space="0" w:color="D9D9D9" w:themeColor="background1" w:themeShade="D9"/>
+              <w:left w:val="single" w:sz="6" w:space="0" w:color="D9D9D9" w:themeColor="background1" w:themeShade="D9"/>
+              <w:bottom w:val="single" w:sz="6" w:space="0" w:color="D9D9D9" w:themeColor="background1" w:themeShade="D9"/>
+              <w:right w:val="single" w:sz="6" w:space="0" w:color="D9D9D9" w:themeColor="background1" w:themeShade="D9"/>
             </w:tcBorders>
-            <w:shd w:val="clear" w:color="auto" w:fill="FFFFFF"/>
-            <w:tcMar>
-              <w:top w:w="80" w:type="dxa"/>
-              <w:left w:w="110" w:type="dxa"/>
-              <w:bottom w:w="80" w:type="dxa"/>
-              <w:right w:w="110" w:type="dxa"/>
-            </w:tcMar>
             <w:vAlign w:val="center"/>
           </w:tcPr>
           <w:p>
             <w:pPr>
+              <w:keepNext/>
               <w:bidi/>
-              <w:spacing w:after="0" w:line="252" w:lineRule="auto"/>
+              <w:spacing w:after="0"/>
               <w:jc w:val="center"/>
               <w:rPr>
-                <w:rFonts w:ascii="Tajawal" w:hAnsi="Tajawal" w:cs="Tajawal"/>
+                <w:rFonts w:ascii="Tajawal" w:eastAsia="Arial" w:hAnsi="Tajawal" w:cs="Tajawal"/>
+                <w:bCs/>
+                <w:color w:val="163A5F"/>
+                <w:sz w:val="23"/>
+                <w:rtl/>
               </w:rPr>
             </w:pPr>
             <w:r>
@@ -577,125 +429,30 @@
             </w:r>
           </w:p>
         </w:tc>
-      </w:tr>
-      <w:tr>
-        <w:trPr>
-          <w:trHeight w:val="20"/>
-          <w:jc w:val="center"/>
-        </w:trPr>
         <w:tc>
           <w:tcPr>
-            <w:tcW w:w="2832" w:type="dxa"/>
+            <w:tcW w:w="2250" w:type="dxa"/>
             <w:tcBorders>
-              <w:top w:val="single" w:sz="6" w:space="0" w:color="D9D9D9"/>
-              <w:left w:val="single" w:sz="6" w:space="0" w:color="D9D9D9"/>
-              <w:bottom w:val="single" w:sz="6" w:space="0" w:color="D9D9D9"/>
-              <w:right w:val="single" w:sz="6" w:space="0" w:color="D9D9D9"/>
+              <w:top w:val="single" w:sz="6" w:space="0" w:color="D9D9D9" w:themeColor="background1" w:themeShade="D9"/>
+              <w:left w:val="single" w:sz="6" w:space="0" w:color="D9D9D9" w:themeColor="background1" w:themeShade="D9"/>
+              <w:bottom w:val="single" w:sz="6" w:space="0" w:color="D9D9D9" w:themeColor="background1" w:themeShade="D9"/>
+              <w:right w:val="single" w:sz="6" w:space="0" w:color="D9D9D9" w:themeColor="background1" w:themeShade="D9"/>
             </w:tcBorders>
-            <w:shd w:val="clear" w:color="auto" w:fill="EAF3F6"/>
-            <w:tcMar>
-              <w:top w:w="90" w:type="dxa"/>
-              <w:left w:w="120" w:type="dxa"/>
-              <w:bottom w:w="90" w:type="dxa"/>
-              <w:right w:w="120" w:type="dxa"/>
-            </w:tcMar>
+            <w:shd w:val="clear" w:color="auto" w:fill="DAEEF3" w:themeFill="accent5" w:themeFillTint="33"/>
             <w:vAlign w:val="center"/>
           </w:tcPr>
           <w:p>
             <w:pPr>
+              <w:keepNext/>
               <w:bidi/>
-              <w:spacing w:after="0" w:line="252" w:lineRule="auto"/>
-              <w:jc w:val="center"/>
-              <w:rPr>
-                <w:rFonts w:ascii="Tajawal" w:hAnsi="Tajawal" w:cs="Tajawal"/>
-                <w:bCs/>
-              </w:rPr>
-            </w:pPr>
-            <w:r>
-              <w:rPr>
-                <w:rFonts w:ascii="Tajawal" w:eastAsia="Arial" w:hAnsi="Tajawal" w:cs="Tajawal"/>
-                <w:bCs/>
-                <w:color w:val="163A5F"/>
-                <w:sz w:val="19"/>
-                <w:rtl/>
-              </w:rPr>
-              <w:t>نوع الجمعية</w:t>
-            </w:r>
-          </w:p>
-        </w:tc>
-        <w:tc>
-          <w:tcPr>
-            <w:tcW w:w="6262" w:type="dxa"/>
-            <w:tcBorders>
-              <w:top w:val="single" w:sz="6" w:space="0" w:color="D9D9D9"/>
-              <w:left w:val="single" w:sz="6" w:space="0" w:color="D9D9D9"/>
-              <w:bottom w:val="single" w:sz="6" w:space="0" w:color="D9D9D9"/>
-              <w:right w:val="single" w:sz="6" w:space="0" w:color="D9D9D9"/>
-            </w:tcBorders>
-            <w:shd w:val="clear" w:color="auto" w:fill="F2F2F2" w:themeFill="background1" w:themeFillShade="F2"/>
-            <w:tcMar>
-              <w:top w:w="90" w:type="dxa"/>
-              <w:left w:w="120" w:type="dxa"/>
-              <w:bottom w:w="90" w:type="dxa"/>
-              <w:right w:w="120" w:type="dxa"/>
-            </w:tcMar>
-            <w:vAlign w:val="center"/>
-          </w:tcPr>
-          <w:p>
-            <w:pPr>
-              <w:bidi/>
-              <w:spacing w:after="0" w:line="252" w:lineRule="auto"/>
-              <w:jc w:val="center"/>
-              <w:rPr>
-                <w:rFonts w:ascii="Tajawal" w:hAnsi="Tajawal" w:cs="Tajawal"/>
-              </w:rPr>
-            </w:pPr>
-            <w:r>
-              <w:rPr>
-                <w:rFonts w:ascii="Tajawal" w:eastAsia="Arial" w:hAnsi="Tajawal" w:cs="Tajawal"/>
-                <w:sz w:val="19"/>
-                <w:rtl/>
-              </w:rPr>
-              <w:t>ائتمان زراعي</w:t>
-            </w:r>
-          </w:p>
-        </w:tc>
-      </w:tr>
-      <w:tr>
-        <w:trPr>
-          <w:trHeight w:val="20"/>
-          <w:jc w:val="center"/>
-        </w:trPr>
-        <w:tc>
-          <w:tcPr>
-            <w:tcW w:w="2832" w:type="dxa"/>
-            <w:tcBorders>
-              <w:top w:val="single" w:sz="6" w:space="0" w:color="D9D9D9"/>
-              <w:left w:val="single" w:sz="6" w:space="0" w:color="D9D9D9"/>
-              <w:bottom w:val="single" w:sz="6" w:space="0" w:color="D9D9D9"/>
-              <w:right w:val="single" w:sz="6" w:space="0" w:color="D9D9D9"/>
-            </w:tcBorders>
-            <w:shd w:val="clear" w:color="auto" w:fill="EAF3F6"/>
-            <w:tcMar>
-              <w:top w:w="90" w:type="dxa"/>
-              <w:left w:w="120" w:type="dxa"/>
-              <w:bottom w:w="90" w:type="dxa"/>
-              <w:right w:w="120" w:type="dxa"/>
-            </w:tcMar>
-            <w:vAlign w:val="center"/>
-          </w:tcPr>
-          <w:p>
-            <w:pPr>
-              <w:bidi/>
-              <w:spacing w:after="0" w:line="252" w:lineRule="auto"/>
+              <w:spacing w:after="0"/>
               <w:jc w:val="center"/>
               <w:rPr>
                 <w:rFonts w:ascii="Tajawal" w:eastAsia="Arial" w:hAnsi="Tajawal" w:cs="Tajawal"/>
                 <w:bCs/>
                 <w:color w:val="163A5F"/>
-                <w:sz w:val="19"/>
+                <w:sz w:val="23"/>
                 <w:rtl/>
-                <w:lang w:bidi="ar-EG"/>
               </w:rPr>
             </w:pPr>
             <w:r>
@@ -713,29 +470,27 @@
         </w:tc>
         <w:tc>
           <w:tcPr>
-            <w:tcW w:w="6262" w:type="dxa"/>
+            <w:tcW w:w="2344" w:type="dxa"/>
             <w:tcBorders>
-              <w:top w:val="single" w:sz="6" w:space="0" w:color="D9D9D9"/>
-              <w:left w:val="single" w:sz="6" w:space="0" w:color="D9D9D9"/>
-              <w:bottom w:val="single" w:sz="6" w:space="0" w:color="D9D9D9"/>
-              <w:right w:val="single" w:sz="6" w:space="0" w:color="D9D9D9"/>
+              <w:top w:val="single" w:sz="6" w:space="0" w:color="D9D9D9" w:themeColor="background1" w:themeShade="D9"/>
+              <w:left w:val="single" w:sz="6" w:space="0" w:color="D9D9D9" w:themeColor="background1" w:themeShade="D9"/>
+              <w:bottom w:val="single" w:sz="6" w:space="0" w:color="D9D9D9" w:themeColor="background1" w:themeShade="D9"/>
+              <w:right w:val="single" w:sz="6" w:space="0" w:color="D9D9D9" w:themeColor="background1" w:themeShade="D9"/>
             </w:tcBorders>
-            <w:shd w:val="clear" w:color="auto" w:fill="FFFFFF"/>
-            <w:tcMar>
-              <w:top w:w="80" w:type="dxa"/>
-              <w:left w:w="110" w:type="dxa"/>
-              <w:bottom w:w="80" w:type="dxa"/>
-              <w:right w:w="110" w:type="dxa"/>
-            </w:tcMar>
             <w:vAlign w:val="center"/>
           </w:tcPr>
           <w:p>
             <w:pPr>
+              <w:keepNext/>
               <w:bidi/>
-              <w:spacing w:after="0" w:line="252" w:lineRule="auto"/>
+              <w:spacing w:after="0"/>
               <w:jc w:val="center"/>
               <w:rPr>
-                <w:rFonts w:ascii="Tajawal" w:hAnsi="Tajawal" w:cs="Tajawal"/>
+                <w:rFonts w:ascii="Tajawal" w:eastAsia="Arial" w:hAnsi="Tajawal" w:cs="Tajawal"/>
+                <w:bCs/>
+                <w:color w:val="163A5F"/>
+                <w:sz w:val="23"/>
+                <w:rtl/>
               </w:rPr>
             </w:pPr>
             <w:r>
@@ -751,37 +506,103 @@
       </w:tr>
       <w:tr>
         <w:trPr>
-          <w:trHeight w:val="20"/>
+          <w:trHeight w:val="432"/>
           <w:jc w:val="center"/>
         </w:trPr>
         <w:tc>
           <w:tcPr>
-            <w:tcW w:w="2832" w:type="dxa"/>
+            <w:tcW w:w="2526" w:type="dxa"/>
             <w:tcBorders>
-              <w:top w:val="single" w:sz="6" w:space="0" w:color="D9D9D9"/>
-              <w:left w:val="single" w:sz="6" w:space="0" w:color="D9D9D9"/>
-              <w:bottom w:val="single" w:sz="6" w:space="0" w:color="D9D9D9"/>
-              <w:right w:val="single" w:sz="6" w:space="0" w:color="D9D9D9"/>
+              <w:top w:val="single" w:sz="6" w:space="0" w:color="D9D9D9" w:themeColor="background1" w:themeShade="D9"/>
+              <w:left w:val="single" w:sz="6" w:space="0" w:color="D9D9D9" w:themeColor="background1" w:themeShade="D9"/>
+              <w:bottom w:val="single" w:sz="6" w:space="0" w:color="D9D9D9" w:themeColor="background1" w:themeShade="D9"/>
+              <w:right w:val="single" w:sz="6" w:space="0" w:color="D9D9D9" w:themeColor="background1" w:themeShade="D9"/>
             </w:tcBorders>
-            <w:shd w:val="clear" w:color="auto" w:fill="EAF3F6"/>
-            <w:tcMar>
-              <w:top w:w="90" w:type="dxa"/>
-              <w:left w:w="120" w:type="dxa"/>
-              <w:bottom w:w="90" w:type="dxa"/>
-              <w:right w:w="120" w:type="dxa"/>
-            </w:tcMar>
+            <w:shd w:val="clear" w:color="auto" w:fill="DAEEF3" w:themeFill="accent5" w:themeFillTint="33"/>
             <w:vAlign w:val="center"/>
           </w:tcPr>
           <w:p>
             <w:pPr>
+              <w:keepNext/>
               <w:bidi/>
-              <w:spacing w:after="0" w:line="252" w:lineRule="auto"/>
+              <w:spacing w:after="0"/>
               <w:jc w:val="center"/>
               <w:rPr>
-                <w:rFonts w:ascii="Tajawal" w:hAnsi="Tajawal" w:cs="Tajawal"/>
+                <w:rFonts w:ascii="Tajawal" w:eastAsia="Arial" w:hAnsi="Tajawal" w:cs="Tajawal"/>
                 <w:bCs/>
+                <w:color w:val="163A5F"/>
+                <w:sz w:val="19"/>
                 <w:rtl/>
-                <w:lang w:bidi="ar-EG"/>
+              </w:rPr>
+            </w:pPr>
+            <w:r>
+              <w:rPr>
+                <w:rFonts w:ascii="Tajawal" w:eastAsia="Arial" w:hAnsi="Tajawal" w:cs="Tajawal"/>
+                <w:bCs/>
+                <w:color w:val="163A5F"/>
+                <w:sz w:val="19"/>
+                <w:rtl/>
+              </w:rPr>
+              <w:t>نوع الجمعية</w:t>
+            </w:r>
+          </w:p>
+        </w:tc>
+        <w:tc>
+          <w:tcPr>
+            <w:tcW w:w="3690" w:type="dxa"/>
+            <w:tcBorders>
+              <w:top w:val="single" w:sz="6" w:space="0" w:color="D9D9D9" w:themeColor="background1" w:themeShade="D9"/>
+              <w:left w:val="single" w:sz="6" w:space="0" w:color="D9D9D9" w:themeColor="background1" w:themeShade="D9"/>
+              <w:bottom w:val="single" w:sz="6" w:space="0" w:color="D9D9D9" w:themeColor="background1" w:themeShade="D9"/>
+            </w:tcBorders>
+            <w:vAlign w:val="center"/>
+          </w:tcPr>
+          <w:p>
+            <w:pPr>
+              <w:keepNext/>
+              <w:bidi/>
+              <w:spacing w:after="0"/>
+              <w:jc w:val="center"/>
+              <w:rPr>
+                <w:rFonts w:ascii="Tajawal" w:eastAsia="Arial" w:hAnsi="Tajawal" w:cs="Tajawal"/>
+                <w:bCs/>
+                <w:color w:val="163A5F"/>
+                <w:sz w:val="23"/>
+                <w:rtl/>
+              </w:rPr>
+            </w:pPr>
+            <w:r>
+              <w:rPr>
+                <w:rFonts w:ascii="Tajawal" w:eastAsia="Arial" w:hAnsi="Tajawal" w:cs="Tajawal"/>
+                <w:sz w:val="19"/>
+                <w:rtl/>
+              </w:rPr>
+              <w:t>ائتمان زراعي</w:t>
+            </w:r>
+          </w:p>
+        </w:tc>
+        <w:tc>
+          <w:tcPr>
+            <w:tcW w:w="2250" w:type="dxa"/>
+            <w:tcBorders>
+              <w:top w:val="single" w:sz="6" w:space="0" w:color="D9D9D9" w:themeColor="background1" w:themeShade="D9"/>
+              <w:bottom w:val="single" w:sz="6" w:space="0" w:color="D9D9D9" w:themeColor="background1" w:themeShade="D9"/>
+            </w:tcBorders>
+            <w:shd w:val="clear" w:color="auto" w:fill="DAEEF3" w:themeFill="accent5" w:themeFillTint="33"/>
+            <w:vAlign w:val="center"/>
+          </w:tcPr>
+          <w:p>
+            <w:pPr>
+              <w:keepNext/>
+              <w:bidi/>
+              <w:spacing w:after="0"/>
+              <w:jc w:val="center"/>
+              <w:rPr>
+                <w:rFonts w:ascii="Tajawal" w:eastAsia="Arial" w:hAnsi="Tajawal" w:cs="Tajawal"/>
+                <w:bCs/>
+                <w:color w:val="163A5F"/>
+                <w:sz w:val="23"/>
+                <w:rtl/>
               </w:rPr>
             </w:pPr>
             <w:r>
@@ -799,29 +620,26 @@
         </w:tc>
         <w:tc>
           <w:tcPr>
-            <w:tcW w:w="6262" w:type="dxa"/>
+            <w:tcW w:w="2344" w:type="dxa"/>
             <w:tcBorders>
-              <w:top w:val="single" w:sz="6" w:space="0" w:color="D9D9D9"/>
-              <w:left w:val="single" w:sz="6" w:space="0" w:color="D9D9D9"/>
-              <w:bottom w:val="single" w:sz="6" w:space="0" w:color="D9D9D9"/>
-              <w:right w:val="single" w:sz="6" w:space="0" w:color="D9D9D9"/>
+              <w:top w:val="single" w:sz="6" w:space="0" w:color="D9D9D9" w:themeColor="background1" w:themeShade="D9"/>
+              <w:bottom w:val="single" w:sz="6" w:space="0" w:color="D9D9D9" w:themeColor="background1" w:themeShade="D9"/>
+              <w:right w:val="single" w:sz="6" w:space="0" w:color="D9D9D9" w:themeColor="background1" w:themeShade="D9"/>
             </w:tcBorders>
-            <w:shd w:val="clear" w:color="auto" w:fill="F2F2F2" w:themeFill="background1" w:themeFillShade="F2"/>
-            <w:tcMar>
-              <w:top w:w="90" w:type="dxa"/>
-              <w:left w:w="120" w:type="dxa"/>
-              <w:bottom w:w="90" w:type="dxa"/>
-              <w:right w:w="120" w:type="dxa"/>
-            </w:tcMar>
             <w:vAlign w:val="center"/>
           </w:tcPr>
           <w:p>
             <w:pPr>
+              <w:keepNext/>
               <w:bidi/>
-              <w:spacing w:after="0" w:line="252" w:lineRule="auto"/>
+              <w:spacing w:after="0"/>
               <w:jc w:val="center"/>
               <w:rPr>
-                <w:rFonts w:ascii="Tajawal" w:hAnsi="Tajawal" w:cs="Tajawal"/>
+                <w:rFonts w:ascii="Tajawal" w:eastAsia="Arial" w:hAnsi="Tajawal" w:cs="Tajawal"/>
+                <w:bCs/>
+                <w:color w:val="163A5F"/>
+                <w:sz w:val="23"/>
+                <w:rtl/>
               </w:rPr>
             </w:pPr>
             <w:r>
@@ -1489,7 +1307,18 @@
           <w:sz w:val="17"/>
           <w:rtl/>
         </w:rPr>
-        <w:t>ملاحظة:</w:t>
+        <w:t>ملاحظة</w:t>
+      </w:r>
+      <w:r>
+        <w:rPr>
+          <w:rFonts w:ascii="Tajawal" w:eastAsia="Arial" w:hAnsi="Tajawal" w:cs="Tajawal"/>
+          <w:b/>
+          <w:bCs/>
+          <w:color w:val="5B6872"/>
+          <w:sz w:val="17"/>
+          <w:rtl/>
+        </w:rPr>
+        <w:t>:</w:t>
       </w:r>
       <w:r>
         <w:rPr>
@@ -1529,19 +1358,25 @@
         <w:tblW w:w="0" w:type="auto"/>
         <w:jc w:val="center"/>
         <w:tblLayout w:type="fixed"/>
+        <w:tblCellMar>
+          <w:left w:w="0" w:type="dxa"/>
+          <w:right w:w="0" w:type="dxa"/>
+        </w:tblCellMar>
         <w:tblLook w:val="04A0" w:firstRow="1" w:lastRow="0" w:firstColumn="1" w:lastColumn="0" w:noHBand="0" w:noVBand="1"/>
       </w:tblPr>
       <w:tblGrid>
-        <w:gridCol w:w="10426"/>
+        <w:gridCol w:w="9916"/>
+        <w:gridCol w:w="510"/>
       </w:tblGrid>
       <w:tr>
         <w:trPr>
-          <w:trHeight w:val="237"/>
+          <w:trHeight w:val="20"/>
           <w:jc w:val="center"/>
         </w:trPr>
         <w:tc>
           <w:tcPr>
             <w:tcW w:w="10426" w:type="dxa"/>
+            <w:gridSpan w:val="2"/>
             <w:tcBorders>
               <w:top w:val="single" w:sz="6" w:space="0" w:color="D9D9D9"/>
               <w:left w:val="single" w:sz="6" w:space="0" w:color="D9D9D9"/>
@@ -1561,15 +1396,15 @@
             <w:pPr>
               <w:bidi/>
               <w:spacing w:after="0" w:line="252" w:lineRule="auto"/>
-              <w:jc w:val="center"/>
               <w:rPr>
                 <w:rFonts w:ascii="Tajawal" w:hAnsi="Tajawal" w:cs="Tajawal"/>
+                <w:bCs/>
               </w:rPr>
             </w:pPr>
             <w:r>
               <w:rPr>
                 <w:rFonts w:ascii="Tajawal" w:eastAsia="Arial" w:hAnsi="Tajawal" w:cs="Tajawal"/>
-                <w:b/>
+                <w:bCs/>
                 <w:color w:val="FFFFFF"/>
                 <w:sz w:val="19"/>
                 <w:rtl/>
@@ -1586,12 +1421,12 @@
         </w:trPr>
         <w:tc>
           <w:tcPr>
-            <w:tcW w:w="10426" w:type="dxa"/>
+            <w:tcW w:w="9916" w:type="dxa"/>
             <w:tcBorders>
               <w:top w:val="single" w:sz="6" w:space="0" w:color="D9D9D9"/>
               <w:left w:val="single" w:sz="6" w:space="0" w:color="D9D9D9"/>
               <w:bottom w:val="single" w:sz="6" w:space="0" w:color="D9D9D9"/>
-              <w:right w:val="single" w:sz="6" w:space="0" w:color="D9D9D9"/>
+              <w:right w:val="single" w:sz="6" w:space="0" w:color="D9D9D9" w:themeColor="background1" w:themeShade="D9"/>
             </w:tcBorders>
             <w:shd w:val="clear" w:color="auto" w:fill="FFFFFF"/>
             <w:tcMar>
@@ -1605,78 +1440,49 @@
           <w:p>
             <w:pPr>
               <w:bidi/>
-              <w:spacing w:after="0" w:line="252" w:lineRule="auto"/>
-              <w:jc w:val="center"/>
+              <w:spacing w:after="0" w:line="240" w:lineRule="auto"/>
               <w:rPr>
                 <w:rFonts w:ascii="Tajawal" w:hAnsi="Tajawal" w:cs="Tajawal"/>
               </w:rPr>
             </w:pPr>
             <w:r>
               <w:rPr>
-                <w:rFonts w:ascii="Tajawal" w:eastAsia="Arial" w:hAnsi="Tajawal" w:cs="Tajawal"/>
-                <w:sz w:val="19"/>
+                <w:rFonts w:ascii="Tajawal" w:hAnsi="Tajawal" w:cs="Tajawal"/>
+                <w:sz w:val="20"/>
                 <w:rtl/>
               </w:rPr>
-              <w:t>لا يوجد</w:t>
+              <w:t xml:space="preserve">جميع أرقام الأراضي الواردة في خانة </w:t>
+            </w:r>
+            <w:r>
+              <w:rPr>
+                <w:rFonts w:ascii="Tajawal" w:hAnsi="Tajawal" w:cs="Tajawal"/>
+                <w:b/>
+                <w:bCs/>
+                <w:sz w:val="20"/>
+                <w:rtl/>
+              </w:rPr>
+              <w:t>«رقم الأرض من الحصر الميداني»</w:t>
+            </w:r>
+            <w:r>
+              <w:rPr>
+                <w:rFonts w:ascii="Tajawal" w:hAnsi="Tajawal" w:cs="Tajawal"/>
+                <w:sz w:val="20"/>
+                <w:rtl/>
+              </w:rPr>
+              <w:t xml:space="preserve"> مصدرها منظومة كارت الفلاح، ويتم تسجيلها من خلال جهاز التابلت التابع للجمعية.</w:t>
             </w:r>
           </w:p>
         </w:tc>
-      </w:tr>
-    </w:tbl>
-    <w:p>
-      <w:pPr>
-        <w:keepNext/>
-        <w:bidi/>
-        <w:spacing w:before="100" w:after="0"/>
-        <w:jc w:val="center"/>
-        <w:rPr>
-          <w:rFonts w:ascii="Tajawal" w:hAnsi="Tajawal" w:cs="Tajawal"/>
-          <w:bCs/>
-        </w:rPr>
-      </w:pPr>
-      <w:r>
-        <w:rPr>
-          <w:rFonts w:ascii="Tajawal" w:eastAsia="Arial" w:hAnsi="Tajawal" w:cs="Tajawal"/>
-          <w:bCs/>
-          <w:color w:val="163A5F"/>
-          <w:sz w:val="23"/>
-          <w:rtl/>
-        </w:rPr>
-        <w:br/>
-        <w:t>مرفقات التسليم</w:t>
-      </w:r>
-    </w:p>
-    <w:tbl>
-      <w:tblPr>
-        <w:tblW w:w="10333" w:type="dxa"/>
-        <w:jc w:val="center"/>
-        <w:tblLayout w:type="fixed"/>
-        <w:tblLook w:val="04A0" w:firstRow="1" w:lastRow="0" w:firstColumn="1" w:lastColumn="0" w:noHBand="0" w:noVBand="1"/>
-      </w:tblPr>
-      <w:tblGrid>
-        <w:gridCol w:w="8767"/>
-        <w:gridCol w:w="1566"/>
-      </w:tblGrid>
-      <w:tr>
-        <w:trPr>
-          <w:jc w:val="center"/>
-        </w:trPr>
         <w:tc>
           <w:tcPr>
-            <w:tcW w:w="8767" w:type="dxa"/>
+            <w:tcW w:w="510" w:type="dxa"/>
             <w:tcBorders>
               <w:top w:val="single" w:sz="6" w:space="0" w:color="D9D9D9"/>
-              <w:left w:val="single" w:sz="6" w:space="0" w:color="D9D9D9"/>
+              <w:left w:val="single" w:sz="6" w:space="0" w:color="D9D9D9" w:themeColor="background1" w:themeShade="D9"/>
               <w:bottom w:val="single" w:sz="6" w:space="0" w:color="D9D9D9"/>
               <w:right w:val="single" w:sz="6" w:space="0" w:color="D9D9D9"/>
             </w:tcBorders>
-            <w:shd w:val="clear" w:color="auto" w:fill="1D466E"/>
-            <w:tcMar>
-              <w:top w:w="80" w:type="dxa"/>
-              <w:left w:w="110" w:type="dxa"/>
-              <w:bottom w:w="80" w:type="dxa"/>
-              <w:right w:w="110" w:type="dxa"/>
-            </w:tcMar>
+            <w:shd w:val="clear" w:color="auto" w:fill="FFFFFF"/>
             <w:vAlign w:val="center"/>
           </w:tcPr>
           <w:p>
@@ -1686,36 +1492,67 @@
               <w:jc w:val="center"/>
               <w:rPr>
                 <w:rFonts w:ascii="Tajawal" w:hAnsi="Tajawal" w:cs="Tajawal"/>
+                <w:b/>
+                <w:bCs/>
               </w:rPr>
             </w:pPr>
             <w:r>
               <w:rPr>
-                <w:rFonts w:ascii="Tajawal" w:eastAsia="Arial" w:hAnsi="Tajawal" w:cs="Tajawal"/>
+                <w:rFonts w:ascii="Tajawal" w:hAnsi="Tajawal" w:cs="Tajawal"/>
                 <w:b/>
-                <w:color w:val="FFFFFF"/>
+                <w:bCs/>
+              </w:rPr>
+              <w:t>-</w:t>
+            </w:r>
+          </w:p>
+        </w:tc>
+      </w:tr>
+      <w:tr>
+        <w:trPr>
+          <w:trHeight w:val="20"/>
+          <w:jc w:val="center"/>
+        </w:trPr>
+        <w:tc>
+          <w:tcPr>
+            <w:tcW w:w="9916" w:type="dxa"/>
+            <w:tcBorders>
+              <w:top w:val="single" w:sz="6" w:space="0" w:color="D9D9D9"/>
+              <w:left w:val="single" w:sz="6" w:space="0" w:color="D9D9D9"/>
+              <w:bottom w:val="single" w:sz="6" w:space="0" w:color="D9D9D9"/>
+              <w:right w:val="single" w:sz="6" w:space="0" w:color="D9D9D9" w:themeColor="background1" w:themeShade="D9"/>
+            </w:tcBorders>
+            <w:shd w:val="clear" w:color="auto" w:fill="FFFFFF"/>
+            <w:tcMar>
+              <w:top w:w="90" w:type="dxa"/>
+              <w:left w:w="120" w:type="dxa"/>
+              <w:bottom w:w="90" w:type="dxa"/>
+              <w:right w:w="120" w:type="dxa"/>
+            </w:tcMar>
+            <w:vAlign w:val="center"/>
+          </w:tcPr>
+          <w:p>
+            <w:pPr>
+              <w:bidi/>
+              <w:spacing w:after="0" w:line="240" w:lineRule="auto"/>
+              <w:rPr>
+                <w:rFonts w:ascii="Tajawal" w:hAnsi="Tajawal" w:cs="Tajawal" w:hint="cs"/>
                 <w:sz w:val="20"/>
                 <w:rtl/>
+                <w:lang w:bidi="ar-EG"/>
               </w:rPr>
-              <w:t>حزمة التسليم المضغوطة</w:t>
-            </w:r>
+            </w:pPr>
           </w:p>
         </w:tc>
         <w:tc>
           <w:tcPr>
-            <w:tcW w:w="1566" w:type="dxa"/>
+            <w:tcW w:w="510" w:type="dxa"/>
             <w:tcBorders>
               <w:top w:val="single" w:sz="6" w:space="0" w:color="D9D9D9"/>
-              <w:left w:val="single" w:sz="6" w:space="0" w:color="D9D9D9"/>
+              <w:left w:val="single" w:sz="6" w:space="0" w:color="D9D9D9" w:themeColor="background1" w:themeShade="D9"/>
               <w:bottom w:val="single" w:sz="6" w:space="0" w:color="D9D9D9"/>
               <w:right w:val="single" w:sz="6" w:space="0" w:color="D9D9D9"/>
             </w:tcBorders>
-            <w:shd w:val="clear" w:color="auto" w:fill="1D466E"/>
-            <w:tcMar>
-              <w:top w:w="80" w:type="dxa"/>
-              <w:left w:w="110" w:type="dxa"/>
-              <w:bottom w:w="80" w:type="dxa"/>
-              <w:right w:w="110" w:type="dxa"/>
-            </w:tcMar>
+            <w:shd w:val="clear" w:color="auto" w:fill="FFFFFF"/>
             <w:vAlign w:val="center"/>
           </w:tcPr>
           <w:p>
@@ -1725,118 +1562,17 @@
               <w:jc w:val="center"/>
               <w:rPr>
                 <w:rFonts w:ascii="Tajawal" w:hAnsi="Tajawal" w:cs="Tajawal"/>
+                <w:b/>
+                <w:bCs/>
               </w:rPr>
             </w:pPr>
             <w:r>
               <w:rPr>
-                <w:rFonts w:ascii="Tajawal" w:eastAsia="Arial" w:hAnsi="Tajawal" w:cs="Tajawal"/>
+                <w:rFonts w:ascii="Tajawal" w:hAnsi="Tajawal" w:cs="Tajawal"/>
                 <w:b/>
-                <w:color w:val="FFFFFF"/>
-                <w:sz w:val="20"/>
-                <w:rtl/>
+                <w:bCs/>
               </w:rPr>
-              <w:t>الحالة</w:t>
-            </w:r>
-          </w:p>
-        </w:tc>
-      </w:tr>
-      <w:tr>
-        <w:trPr>
-          <w:jc w:val="center"/>
-        </w:trPr>
-        <w:tc>
-          <w:tcPr>
-            <w:tcW w:w="8767" w:type="dxa"/>
-            <w:tcBorders>
-              <w:top w:val="single" w:sz="6" w:space="0" w:color="D9D9D9"/>
-              <w:left w:val="single" w:sz="6" w:space="0" w:color="D9D9D9"/>
-              <w:bottom w:val="single" w:sz="6" w:space="0" w:color="D9D9D9"/>
-              <w:right w:val="single" w:sz="6" w:space="0" w:color="D9D9D9"/>
-            </w:tcBorders>
-            <w:shd w:val="clear" w:color="auto" w:fill="FFFFFF"/>
-            <w:tcMar>
-              <w:top w:w="80" w:type="dxa"/>
-              <w:left w:w="110" w:type="dxa"/>
-              <w:bottom w:w="80" w:type="dxa"/>
-              <w:right w:w="110" w:type="dxa"/>
-            </w:tcMar>
-            <w:vAlign w:val="center"/>
-          </w:tcPr>
-          <w:p>
-            <w:pPr>
-              <w:bidi/>
-              <w:spacing w:after="0" w:line="252" w:lineRule="auto"/>
-              <w:jc w:val="center"/>
-              <w:rPr>
-                <w:rFonts w:ascii="Tajawal" w:hAnsi="Tajawal" w:cs="Tajawal"/>
-              </w:rPr>
-            </w:pPr>
-            <w:r>
-              <w:rPr>
-                <w:rFonts w:ascii="Tajawal" w:eastAsia="Arial" w:hAnsi="Tajawal" w:cs="Tajawal"/>
-                <w:color w:val="252C32"/>
-                <w:sz w:val="19"/>
-                <w:rtl/>
-              </w:rPr>
-              <w:t xml:space="preserve">ملف التسليم المضغوط باسم </w:t>
-            </w:r>
-            <w:r>
-              <w:rPr>
-                <w:rFonts w:ascii="Tajawal" w:eastAsia="Arial" w:hAnsi="Tajawal" w:cs="Tajawal" w:hint="cs"/>
-                <w:color w:val="252C32"/>
-                <w:sz w:val="19"/>
-                <w:rtl/>
-              </w:rPr>
-              <w:t>""</w:t>
-            </w:r>
-            <w:r>
-              <w:rPr>
-                <w:rFonts w:ascii="Tajawal" w:eastAsia="Arial" w:hAnsi="Tajawal" w:cs="Tajawal"/>
-                <w:color w:val="252C32"/>
-                <w:sz w:val="19"/>
-                <w:rtl/>
-              </w:rPr>
-              <w:br/>
-              <w:t>يحتوي على قاعدة البيانات الجغرافية وملف بيانات القطع Excel</w:t>
-            </w:r>
-          </w:p>
-        </w:tc>
-        <w:tc>
-          <w:tcPr>
-            <w:tcW w:w="1566" w:type="dxa"/>
-            <w:tcBorders>
-              <w:top w:val="single" w:sz="6" w:space="0" w:color="D9D9D9"/>
-              <w:left w:val="single" w:sz="6" w:space="0" w:color="D9D9D9"/>
-              <w:bottom w:val="single" w:sz="6" w:space="0" w:color="D9D9D9"/>
-              <w:right w:val="single" w:sz="6" w:space="0" w:color="D9D9D9"/>
-            </w:tcBorders>
-            <w:shd w:val="clear" w:color="auto" w:fill="FFFFFF"/>
-            <w:tcMar>
-              <w:top w:w="80" w:type="dxa"/>
-              <w:left w:w="110" w:type="dxa"/>
-              <w:bottom w:w="80" w:type="dxa"/>
-              <w:right w:w="110" w:type="dxa"/>
-            </w:tcMar>
-            <w:vAlign w:val="center"/>
-          </w:tcPr>
-          <w:p>
-            <w:pPr>
-              <w:bidi/>
-              <w:spacing w:after="0" w:line="252" w:lineRule="auto"/>
-              <w:jc w:val="center"/>
-              <w:rPr>
-                <w:rFonts w:ascii="Tajawal" w:hAnsi="Tajawal" w:cs="Tajawal"/>
-              </w:rPr>
-            </w:pPr>
-            <w:r>
-              <w:rPr>
-                <w:rFonts w:ascii="Tajawal" w:eastAsia="Arial" w:hAnsi="Tajawal" w:cs="Tajawal"/>
-                <w:b/>
-                <w:color w:val="252C32"/>
-                <w:sz w:val="20"/>
-                <w:rtl/>
-              </w:rPr>
-              <w:t>مرفق</w:t>
+              <w:t>-</w:t>
             </w:r>
           </w:p>
         </w:tc>
@@ -1845,12 +1581,106 @@
     <w:p>
       <w:pPr>
         <w:bidi/>
-        <w:spacing w:after="0"/>
-        <w:jc w:val="center"/>
+        <w:spacing w:before="240"/>
         <w:rPr>
           <w:rFonts w:ascii="Tajawal" w:hAnsi="Tajawal" w:cs="Tajawal"/>
+          <w:b/>
+          <w:bCs/>
+          <w:sz w:val="20"/>
+          <w:szCs w:val="20"/>
         </w:rPr>
       </w:pPr>
+      <w:r>
+        <w:rPr>
+          <w:rFonts w:ascii="Tajawal" w:eastAsia="Arial" w:hAnsi="Tajawal" w:cs="Tajawal"/>
+          <w:b/>
+          <w:bCs/>
+          <w:color w:val="5B6872"/>
+          <w:sz w:val="17"/>
+          <w:rtl/>
+        </w:rPr>
+        <w:t>ملاحظة</w:t>
+      </w:r>
+      <w:r>
+        <w:rPr>
+          <w:rFonts w:ascii="Tajawal" w:eastAsia="Arial" w:hAnsi="Tajawal" w:cs="Tajawal"/>
+          <w:b/>
+          <w:bCs/>
+          <w:color w:val="5B6872"/>
+          <w:sz w:val="17"/>
+          <w:rtl/>
+        </w:rPr>
+        <w:t>:</w:t>
+      </w:r>
+      <w:r>
+        <w:rPr>
+          <w:rFonts w:ascii="Tajawal" w:eastAsia="Arial" w:hAnsi="Tajawal" w:cs="Tajawal"/>
+          <w:color w:val="5B6872"/>
+          <w:sz w:val="17"/>
+          <w:rtl/>
+        </w:rPr>
+        <w:t xml:space="preserve"> </w:t>
+      </w:r>
+      <w:r>
+        <w:rPr>
+          <w:rFonts w:ascii="Tajawal" w:eastAsia="Arial" w:hAnsi="Tajawal" w:cs="Tajawal"/>
+          <w:color w:val="5B6872"/>
+          <w:sz w:val="17"/>
+          <w:rtl/>
+        </w:rPr>
+        <w:t xml:space="preserve">عند رصد أي مشكلة في الـ </w:t>
+      </w:r>
+      <w:r>
+        <w:rPr>
+          <w:rFonts w:ascii="Tajawal" w:eastAsia="Arial" w:hAnsi="Tajawal" w:cs="Tajawal"/>
+          <w:b/>
+          <w:bCs/>
+          <w:color w:val="5B6872"/>
+          <w:sz w:val="20"/>
+          <w:szCs w:val="20"/>
+        </w:rPr>
+        <w:t>Geometry</w:t>
+      </w:r>
+      <w:r>
+        <w:rPr>
+          <w:rFonts w:ascii="Tajawal" w:eastAsia="Arial" w:hAnsi="Tajawal" w:cs="Tajawal"/>
+          <w:color w:val="5B6872"/>
+          <w:sz w:val="17"/>
+          <w:rtl/>
+        </w:rPr>
+        <w:t xml:space="preserve"> أو الرسم، يرجى إنشاء </w:t>
+      </w:r>
+      <w:r>
+        <w:rPr>
+          <w:rFonts w:ascii="Tajawal" w:eastAsia="Arial" w:hAnsi="Tajawal" w:cs="Tajawal"/>
+          <w:b/>
+          <w:bCs/>
+          <w:color w:val="5B6872"/>
+          <w:sz w:val="20"/>
+          <w:szCs w:val="20"/>
+        </w:rPr>
+        <w:t>Bookmark</w:t>
+      </w:r>
+      <w:r>
+        <w:rPr>
+          <w:rFonts w:ascii="Tajawal" w:eastAsia="Arial" w:hAnsi="Tajawal" w:cs="Tajawal"/>
+          <w:color w:val="5B6872"/>
+          <w:sz w:val="17"/>
+          <w:rtl/>
+        </w:rPr>
+        <w:t xml:space="preserve"> يوضح موقع القطعة داخل مشروع </w:t>
+      </w:r>
+      <w:r>
+        <w:rPr>
+          <w:rFonts w:ascii="Tajawal" w:eastAsia="Arial" w:hAnsi="Tajawal" w:cs="Tajawal"/>
+          <w:b/>
+          <w:bCs/>
+          <w:color w:val="5B6872"/>
+          <w:sz w:val="20"/>
+          <w:szCs w:val="20"/>
+        </w:rPr>
+        <w:t>GIS</w:t>
+      </w:r>
     </w:p>
     <w:p>
       <w:pPr>
@@ -1861,6 +1691,7 @@
         </w:rPr>
       </w:pPr>
     </w:p>
+    <w:p/>
     <w:sectPr>
       <w:pgSz w:w="12240" w:h="15840"/>
       <w:pgMar w:top="720" w:right="720" w:bottom="720" w:left="720" w:header="288" w:footer="259" w:gutter="0"/>
@@ -2094,6 +1925,232 @@
       </w:rPr>
     </w:lvl>
   </w:abstractNum>
+  <w:abstractNum w:abstractNumId="9" w15:restartNumberingAfterBreak="0">
+    <w:nsid w:val="294A25A1"/>
+    <w:multiLevelType w:val="hybridMultilevel"/>
+    <w:tmpl w:val="8EB4FC1E"/>
+    <w:lvl w:ilvl="0" w:tplc="04090001">
+      <w:start w:val="1"/>
+      <w:numFmt w:val="bullet"/>
+      <w:lvlText w:val=""/>
+      <w:lvlJc w:val="left"/>
+      <w:pPr>
+        <w:ind w:left="360" w:hanging="360"/>
+      </w:pPr>
+      <w:rPr>
+        <w:rFonts w:ascii="Symbol" w:hAnsi="Symbol" w:hint="default"/>
+      </w:rPr>
+    </w:lvl>
+    <w:lvl w:ilvl="1" w:tplc="04090003" w:tentative="1">
+      <w:start w:val="1"/>
+      <w:numFmt w:val="bullet"/>
+      <w:lvlText w:val="o"/>
+      <w:lvlJc w:val="left"/>
+      <w:pPr>
+        <w:ind w:left="1080" w:hanging="360"/>
+      </w:pPr>
+      <w:rPr>
+        <w:rFonts w:ascii="Courier New" w:hAnsi="Courier New" w:cs="Courier New" w:hint="default"/>
+      </w:rPr>
+    </w:lvl>
+    <w:lvl w:ilvl="2" w:tplc="04090005" w:tentative="1">
+      <w:start w:val="1"/>
+      <w:numFmt w:val="bullet"/>
+      <w:lvlText w:val=""/>
+      <w:lvlJc w:val="left"/>
+      <w:pPr>
+        <w:ind w:left="1800" w:hanging="360"/>
+      </w:pPr>
+      <w:rPr>
+        <w:rFonts w:ascii="Wingdings" w:hAnsi="Wingdings" w:hint="default"/>
+      </w:rPr>
+    </w:lvl>
+    <w:lvl w:ilvl="3" w:tplc="04090001" w:tentative="1">
+      <w:start w:val="1"/>
+      <w:numFmt w:val="bullet"/>
+      <w:lvlText w:val=""/>
+      <w:lvlJc w:val="left"/>
+      <w:pPr>
+        <w:ind w:left="2520" w:hanging="360"/>
+      </w:pPr>
+      <w:rPr>
+        <w:rFonts w:ascii="Symbol" w:hAnsi="Symbol" w:hint="default"/>
+      </w:rPr>
+    </w:lvl>
+    <w:lvl w:ilvl="4" w:tplc="04090003" w:tentative="1">
+      <w:start w:val="1"/>
+      <w:numFmt w:val="bullet"/>
+      <w:lvlText w:val="o"/>
+      <w:lvlJc w:val="left"/>
+      <w:pPr>
+        <w:ind w:left="3240" w:hanging="360"/>
+      </w:pPr>
+      <w:rPr>
+        <w:rFonts w:ascii="Courier New" w:hAnsi="Courier New" w:cs="Courier New" w:hint="default"/>
+      </w:rPr>
+    </w:lvl>
+    <w:lvl w:ilvl="5" w:tplc="04090005" w:tentative="1">
+      <w:start w:val="1"/>
+      <w:numFmt w:val="bullet"/>
+      <w:lvlText w:val=""/>
+      <w:lvlJc w:val="left"/>
+      <w:pPr>
+        <w:ind w:left="3960" w:hanging="360"/>
+      </w:pPr>
+      <w:rPr>
+        <w:rFonts w:ascii="Wingdings" w:hAnsi="Wingdings" w:hint="default"/>
+      </w:rPr>
+    </w:lvl>
+    <w:lvl w:ilvl="6" w:tplc="04090001" w:tentative="1">
+      <w:start w:val="1"/>
+      <w:numFmt w:val="bullet"/>
+      <w:lvlText w:val=""/>
+      <w:lvlJc w:val="left"/>
+      <w:pPr>
+        <w:ind w:left="4680" w:hanging="360"/>
+      </w:pPr>
+      <w:rPr>
+        <w:rFonts w:ascii="Symbol" w:hAnsi="Symbol" w:hint="default"/>
+      </w:rPr>
+    </w:lvl>
+    <w:lvl w:ilvl="7" w:tplc="04090003" w:tentative="1">
+      <w:start w:val="1"/>
+      <w:numFmt w:val="bullet"/>
+      <w:lvlText w:val="o"/>
+      <w:lvlJc w:val="left"/>
+      <w:pPr>
+        <w:ind w:left="5400" w:hanging="360"/>
+      </w:pPr>
+      <w:rPr>
+        <w:rFonts w:ascii="Courier New" w:hAnsi="Courier New" w:cs="Courier New" w:hint="default"/>
+      </w:rPr>
+    </w:lvl>
+    <w:lvl w:ilvl="8" w:tplc="04090005" w:tentative="1">
+      <w:start w:val="1"/>
+      <w:numFmt w:val="bullet"/>
+      <w:lvlText w:val=""/>
+      <w:lvlJc w:val="left"/>
+      <w:pPr>
+        <w:ind w:left="6120" w:hanging="360"/>
+      </w:pPr>
+      <w:rPr>
+        <w:rFonts w:ascii="Wingdings" w:hAnsi="Wingdings" w:hint="default"/>
+      </w:rPr>
+    </w:lvl>
+  </w:abstractNum>
+  <w:abstractNum w:abstractNumId="10" w15:restartNumberingAfterBreak="0">
+    <w:nsid w:val="54CD1718"/>
+    <w:multiLevelType w:val="hybridMultilevel"/>
+    <w:tmpl w:val="530A1AFE"/>
+    <w:lvl w:ilvl="0" w:tplc="04090001">
+      <w:start w:val="1"/>
+      <w:numFmt w:val="bullet"/>
+      <w:lvlText w:val=""/>
+      <w:lvlJc w:val="left"/>
+      <w:pPr>
+        <w:ind w:left="360" w:hanging="360"/>
+      </w:pPr>
+      <w:rPr>
+        <w:rFonts w:ascii="Symbol" w:hAnsi="Symbol" w:hint="default"/>
+      </w:rPr>
+    </w:lvl>
+    <w:lvl w:ilvl="1" w:tplc="04090003" w:tentative="1">
+      <w:start w:val="1"/>
+      <w:numFmt w:val="bullet"/>
+      <w:lvlText w:val="o"/>
+      <w:lvlJc w:val="left"/>
+      <w:pPr>
+        <w:ind w:left="1080" w:hanging="360"/>
+      </w:pPr>
+      <w:rPr>
+        <w:rFonts w:ascii="Courier New" w:hAnsi="Courier New" w:cs="Courier New" w:hint="default"/>
+      </w:rPr>
+    </w:lvl>
+    <w:lvl w:ilvl="2" w:tplc="04090005" w:tentative="1">
+      <w:start w:val="1"/>
+      <w:numFmt w:val="bullet"/>
+      <w:lvlText w:val=""/>
+      <w:lvlJc w:val="left"/>
+      <w:pPr>
+        <w:ind w:left="1800" w:hanging="360"/>
+      </w:pPr>
+      <w:rPr>
+        <w:rFonts w:ascii="Wingdings" w:hAnsi="Wingdings" w:hint="default"/>
+      </w:rPr>
+    </w:lvl>
+    <w:lvl w:ilvl="3" w:tplc="04090001" w:tentative="1">
+      <w:start w:val="1"/>
+      <w:numFmt w:val="bullet"/>
+      <w:lvlText w:val=""/>
+      <w:lvlJc w:val="left"/>
+      <w:pPr>
+        <w:ind w:left="2520" w:hanging="360"/>
+      </w:pPr>
+      <w:rPr>
+        <w:rFonts w:ascii="Symbol" w:hAnsi="Symbol" w:hint="default"/>
+      </w:rPr>
+    </w:lvl>
+    <w:lvl w:ilvl="4" w:tplc="04090003" w:tentative="1">
+      <w:start w:val="1"/>
+      <w:numFmt w:val="bullet"/>
+      <w:lvlText w:val="o"/>
+      <w:lvlJc w:val="left"/>
+      <w:pPr>
+        <w:ind w:left="3240" w:hanging="360"/>
+      </w:pPr>
+      <w:rPr>
+        <w:rFonts w:ascii="Courier New" w:hAnsi="Courier New" w:cs="Courier New" w:hint="default"/>
+      </w:rPr>
+    </w:lvl>
+    <w:lvl w:ilvl="5" w:tplc="04090005" w:tentative="1">
+      <w:start w:val="1"/>
+      <w:numFmt w:val="bullet"/>
+      <w:lvlText w:val=""/>
+      <w:lvlJc w:val="left"/>
+      <w:pPr>
+        <w:ind w:left="3960" w:hanging="360"/>
+      </w:pPr>
+      <w:rPr>
+        <w:rFonts w:ascii="Wingdings" w:hAnsi="Wingdings" w:hint="default"/>
+      </w:rPr>
+    </w:lvl>
+    <w:lvl w:ilvl="6" w:tplc="04090001" w:tentative="1">
+      <w:start w:val="1"/>
+      <w:numFmt w:val="bullet"/>
+      <w:lvlText w:val=""/>
+      <w:lvlJc w:val="left"/>
+      <w:pPr>
+        <w:ind w:left="4680" w:hanging="360"/>
+      </w:pPr>
+      <w:rPr>
+        <w:rFonts w:ascii="Symbol" w:hAnsi="Symbol" w:hint="default"/>
+      </w:rPr>
+    </w:lvl>
+    <w:lvl w:ilvl="7" w:tplc="04090003" w:tentative="1">
+      <w:start w:val="1"/>
+      <w:numFmt w:val="bullet"/>
+      <w:lvlText w:val="o"/>
+      <w:lvlJc w:val="left"/>
+      <w:pPr>
+        <w:ind w:left="5400" w:hanging="360"/>
+      </w:pPr>
+      <w:rPr>
+        <w:rFonts w:ascii="Courier New" w:hAnsi="Courier New" w:cs="Courier New" w:hint="default"/>
+      </w:rPr>
+    </w:lvl>
+    <w:lvl w:ilvl="8" w:tplc="04090005" w:tentative="1">
+      <w:start w:val="1"/>
+      <w:numFmt w:val="bullet"/>
+      <w:lvlText w:val=""/>
+      <w:lvlJc w:val="left"/>
+      <w:pPr>
+        <w:ind w:left="6120" w:hanging="360"/>
+      </w:pPr>
+      <w:rPr>
+        <w:rFonts w:ascii="Wingdings" w:hAnsi="Wingdings" w:hint="default"/>
+      </w:rPr>
+    </w:lvl>
+  </w:abstractNum>
   <w:num w:numId="1" w16cid:durableId="2052074473">
     <w:abstractNumId w:val="8"/>
   </w:num>
@@ -2120,6 +2177,12 @@
   </w:num>
   <w:num w:numId="9" w16cid:durableId="1900940465">
     <w:abstractNumId w:val="0"/>
+  </w:num>
+  <w:num w:numId="10" w16cid:durableId="371082381">
+    <w:abstractNumId w:val="9"/>
+  </w:num>
+  <w:num w:numId="11" w16cid:durableId="4793394">
+    <w:abstractNumId w:val="10"/>
   </w:num>
 </w:numbering>
 </file>

</xml_diff>